<commit_message>
docs(roadmap): add Year-2 archival/partitioning task to Phase 9
At 22k POS invoices/day (8M/year confirmed), tabPOS Invoice will reach
~200-300 GB by Year 3 without archival. Adds task 9-4: MySQL year-
partitioning + cold-archive doctype for periods >13 months. Tagged P2 so
it lands before list-view degradation becomes user-visible (mid-Year-2).
</commit_message>
<xml_diff>
--- a/docs/Sungas-Roadmap-2026-06-v2.docx
+++ b/docs/Sungas-Roadmap-2026-06-v2.docx
@@ -5427,6 +5427,73 @@
             </w:pPr>
             <w:r>
               <w:t xml:space="preserve">🟢 P3</w:t>
+            </w:r>
+          </w:p>
+        </w:tc>
+      </w:tr>
+      <w:tr>
+        <w:tc>
+          <w:tcPr/>
+          <w:p>
+            <w:pPr>
+              <w:pStyle w:val="Compact"/>
+              <w:jc w:val="left"/>
+            </w:pPr>
+            <w:r>
+              <w:rPr>
+                <w:bCs/>
+                <w:b/>
+              </w:rPr>
+              <w:t xml:space="preserve">9-4</w:t>
+            </w:r>
+          </w:p>
+        </w:tc>
+        <w:tc>
+          <w:tcPr/>
+          <w:p>
+            <w:pPr>
+              <w:pStyle w:val="Compact"/>
+              <w:jc w:val="left"/>
+            </w:pPr>
+            <w:r>
+              <w:rPr>
+                <w:bCs/>
+                <w:b/>
+              </w:rPr>
+              <w:t xml:space="preserve">POS Invoice archival / partitioning strategy</w:t>
+            </w:r>
+            <w:r>
+              <w:t xml:space="preserve"> </w:t>
+            </w:r>
+            <w:r>
+              <w:t xml:space="preserve">— at 22k invoices/day (8M/year), plan MySQL year-partition on</w:t>
+            </w:r>
+            <w:r>
+              <w:t xml:space="preserve"> </w:t>
+            </w:r>
+            <w:r>
+              <w:rPr>
+                <w:rStyle w:val="VerbatimChar"/>
+              </w:rPr>
+              <w:t xml:space="preserve">tabPOS Invoice</w:t>
+            </w:r>
+            <w:r>
+              <w:t xml:space="preserve"> </w:t>
+            </w:r>
+            <w:r>
+              <w:t xml:space="preserve">and a cold-archive doctype for closed periods (&gt;13 months). Needed by mid-Year-2 to keep list-view + report performance constant.</w:t>
+            </w:r>
+          </w:p>
+        </w:tc>
+        <w:tc>
+          <w:tcPr/>
+          <w:p>
+            <w:pPr>
+              <w:pStyle w:val="Compact"/>
+              <w:jc w:val="left"/>
+            </w:pPr>
+            <w:r>
+              <w:t xml:space="preserve">🟡 P2</w:t>
             </w:r>
           </w:p>
         </w:tc>

</xml_diff>